<commit_message>
Add reproducibility docs, response/cover docx and md-to-docx converter
Includes requirements.txt, reproducibility_alignment_note.md, reviewer_perspective_critique.md, and docx versions of SMMR and JoCI cover letters and response.

Co-Authored-By: Tatsuki Onishi <bougtoir@gmail.com>
</commit_message>
<xml_diff>
--- a/results/manuscript/smmr_submission/cover_letter.docx
+++ b/results/manuscript/smmr_submission/cover_letter.docx
@@ -12,148 +12,244 @@
         <w:t>[Date]</w:t>
       </w:r>
     </w:p>
-    <w:p/>
     <w:p>
       <w:r>
         <w:t>Professor [Editor-in-Chief name], Editor-in-Chief</w:t>
       </w:r>
     </w:p>
     <w:p>
+      <w:r/>
       <w:r>
-        <w:t>*Statistical Methods in Medical Research*</w:t>
+        <w:rPr>
+          <w:i/>
+        </w:rPr>
+        <w:t>Statistical Methods in Medical Research</w:t>
       </w:r>
+      <w:r/>
     </w:p>
     <w:p>
       <w:r>
         <w:t>SAGE Publications</w:t>
       </w:r>
     </w:p>
-    <w:p/>
     <w:p>
       <w:r>
         <w:t>Dear Professor [Name],</w:t>
       </w:r>
     </w:p>
-    <w:p/>
     <w:p>
       <w:r>
-        <w:t>We wish to submit our manuscript, **“A coherence diagnostic for hidden population structure in observational studies: a simulation study of stratification-based extraction”** (revised from *IONE: Incoherence-Oriented Neutralisation and Extraction for Detecting Hidden Population Structure in Observational Studies*), for consideration by *Statistical Methods in Medical Research*.</w:t>
+        <w:t xml:space="preserve">We wish to submit our manuscript, </w:t>
       </w:r>
-    </w:p>
-    <w:p/>
-    <w:p>
       <w:r>
-        <w:t>**Fit with the journal.**</w:t>
+        <w:rPr>
+          <w:b/>
+        </w:rPr>
+        <w:t>“A coherence diagnostic for hidden population structure in observational studies: a simulation study of stratification-based extraction”</w:t>
+      </w:r>
+      <w:r>
+        <w:t xml:space="preserve"> (revised from </w:t>
+      </w:r>
+      <w:r>
+        <w:rPr>
+          <w:i/>
+        </w:rPr>
+        <w:t>IONE: Incoherence-Oriented Neutralisation and Extraction for Detecting Hidden Population Structure in Observational Studies</w:t>
+      </w:r>
+      <w:r>
+        <w:t xml:space="preserve">), for consideration by </w:t>
+      </w:r>
+      <w:r>
+        <w:rPr>
+          <w:i/>
+        </w:rPr>
+        <w:t>Statistical Methods in Medical Research</w:t>
+      </w:r>
+      <w:r>
+        <w:t>.</w:t>
       </w:r>
     </w:p>
     <w:p>
+      <w:r/>
       <w:r>
-        <w:t>The manuscript develops, benchmarks and reports uncertainty for statistical diagnostics intended for medical and epidemiological observational studies. The proposed C1 and W indicators quantify between- and within-stratum treatment-effect heterogeneity, and the simulation systematically compares the proposed framework with established medical-statistics tools (propensity-score stratification, Gaussian mixture models, prognostic-score stratification). We therefore believe the work will be of interest to the readership of *Statistical Methods in Medical Research*.</w:t>
+        <w:rPr>
+          <w:b/>
+        </w:rPr>
+        <w:t>Fit with the journal.</w:t>
       </w:r>
+      <w:r/>
     </w:p>
-    <w:p/>
     <w:p>
       <w:r>
-        <w:t>**Revisions since the previous peer review.**</w:t>
+        <w:t xml:space="preserve">The manuscript develops, benchmarks and reports uncertainty for statistical diagnostics intended for medical and epidemiological observational studies. The proposed C1 and W indicators quantify between- and within-stratum treatment-effect heterogeneity, and the simulation systematically compares the proposed framework with established medical-statistics tools (propensity-score stratification, Gaussian mixture models, prognostic-score stratification). We therefore believe the work will be of interest to the readership of </w:t>
+      </w:r>
+      <w:r>
+        <w:rPr>
+          <w:i/>
+        </w:rPr>
+        <w:t>Statistical Methods in Medical Research</w:t>
+      </w:r>
+      <w:r>
+        <w:t>.</w:t>
       </w:r>
     </w:p>
     <w:p>
+      <w:r/>
       <w:r>
-        <w:t>A previous version was reviewed by *BMC Medical Research Methodology* and rejected as not suitable for further revision. We have substantially revised the manuscript in response to all reviewer comments:</w:t>
+        <w:rPr>
+          <w:b/>
+        </w:rPr>
+        <w:t>Revisions since the previous peer review.</w:t>
+      </w:r>
+      <w:r/>
+    </w:p>
+    <w:p>
+      <w:r>
+        <w:t xml:space="preserve">A previous version was reviewed by </w:t>
+      </w:r>
+      <w:r>
+        <w:rPr>
+          <w:i/>
+        </w:rPr>
+        <w:t>BMC Medical Research Methodology</w:t>
+      </w:r>
+      <w:r>
+        <w:t xml:space="preserve"> and rejected as not suitable for further revision. We have substantially revised the manuscript in response to all reviewer comments:</w:t>
       </w:r>
     </w:p>
     <w:p>
+      <w:pPr>
+        <w:pStyle w:val="ListBullet"/>
+      </w:pPr>
       <w:r>
-        <w:t>- Reframed the paper as an **exploratory diagnostic-sensitivity study** rather than a fully developed workflow.</w:t>
+        <w:t xml:space="preserve">Reframed the paper as an </w:t>
+      </w:r>
+      <w:r>
+        <w:rPr>
+          <w:b/>
+        </w:rPr>
+        <w:t>exploratory diagnostic-sensitivity study</w:t>
+      </w:r>
+      <w:r>
+        <w:t xml:space="preserve"> rather than a fully developed workflow.</w:t>
       </w:r>
     </w:p>
     <w:p>
+      <w:pPr>
+        <w:pStyle w:val="ListBullet"/>
+      </w:pPr>
       <w:r>
-        <w:t>- Introduced a binary treatment variable into the simulation and made confounding and effect modification explicit.</w:t>
+        <w:t>Introduced a binary treatment variable into the simulation and made confounding and effect modification explicit.</w:t>
       </w:r>
     </w:p>
     <w:p>
+      <w:pPr>
+        <w:pStyle w:val="ListBullet"/>
+      </w:pPr>
       <w:r>
-        <w:t>- Added three active comparators and unified the method taxonomy.</w:t>
+        <w:t>Added three active comparators and unified the method taxonomy.</w:t>
       </w:r>
     </w:p>
     <w:p>
+      <w:pPr>
+        <w:pStyle w:val="ListBullet"/>
+      </w:pPr>
       <w:r>
-        <w:t>- Reconciled the bias-reduction formula and values.</w:t>
+        <w:t>Reconciled the bias-reduction formula and values; the ATE estimand is now the collapsible risk difference.</w:t>
       </w:r>
     </w:p>
     <w:p>
+      <w:pPr>
+        <w:pStyle w:val="ListBullet"/>
+      </w:pPr>
       <w:r>
-        <w:t>- Downgraded C1 claims, added calibration-curve analyses and removed the provisional 0.05 threshold.</w:t>
+        <w:t>Downgraded C1 claims, added calibration-curve analyses and removed the provisional 0.05 threshold.</w:t>
       </w:r>
     </w:p>
     <w:p>
+      <w:pPr>
+        <w:pStyle w:val="ListBullet"/>
+      </w:pPr>
       <w:r>
-        <w:t>- Split W into a simulation-only true-CATE metric and an estimated operational diagnostic.</w:t>
+        <w:t>Split W into a simulation-only true-CATE metric and an estimated operational diagnostic.</w:t>
       </w:r>
     </w:p>
     <w:p>
+      <w:pPr>
+        <w:pStyle w:val="ListBullet"/>
+      </w:pPr>
       <w:r>
-        <w:t>- Implemented a discovery/evaluation split for outcome-informed stratification and quantified induced-bias sensitivity.</w:t>
+        <w:t>Implemented a discovery/evaluation split for outcome-informed stratification and quantified induced-bias sensitivity.</w:t>
       </w:r>
     </w:p>
     <w:p>
+      <w:pPr>
+        <w:pStyle w:val="ListBullet"/>
+      </w:pPr>
       <w:r>
-        <w:t>- Corrected the semi-synthetic-illustration claims and added a comparability discussion.</w:t>
+        <w:t>Corrected the semi-synthetic-illustration claims and added a comparability discussion.</w:t>
       </w:r>
     </w:p>
-    <w:p/>
     <w:p>
+      <w:r/>
       <w:r>
-        <w:t>**Originality and exclusivity.**</w:t>
+        <w:rPr>
+          <w:b/>
+        </w:rPr>
+        <w:t>Originality and exclusivity.</w:t>
       </w:r>
+      <w:r/>
     </w:p>
     <w:p>
       <w:r>
         <w:t>This manuscript is original and is not under consideration elsewhere. All authors have approved the submission.</w:t>
       </w:r>
     </w:p>
-    <w:p/>
     <w:p>
+      <w:r/>
       <w:r>
-        <w:t>**Conflicts and funding.**</w:t>
+        <w:rPr>
+          <w:b/>
+        </w:rPr>
+        <w:t>Conflicts and funding.</w:t>
       </w:r>
+      <w:r/>
     </w:p>
     <w:p>
       <w:r>
         <w:t>The authors have no competing interests. No external funding supported this work.</w:t>
       </w:r>
     </w:p>
-    <w:p/>
     <w:p>
+      <w:r/>
       <w:r>
-        <w:t>**Data and code.**</w:t>
+        <w:rPr>
+          <w:b/>
+        </w:rPr>
+        <w:t>Data and code.</w:t>
       </w:r>
+      <w:r/>
     </w:p>
     <w:p>
       <w:r>
         <w:t>The simulation code and semi-synthetic example data are available in a public repository; a tagged release and, where possible, a Zenodo DOI will be provided. Supplementary materials include ADEMP and STROBE-Sim checklists and full algorithmic details.</w:t>
       </w:r>
     </w:p>
-    <w:p/>
     <w:p>
       <w:r>
         <w:t>Suggested reviewers: [names and emails to be added].</w:t>
       </w:r>
     </w:p>
-    <w:p/>
     <w:p>
       <w:r>
         <w:t>Thank you for considering our submission.</w:t>
       </w:r>
     </w:p>
-    <w:p/>
     <w:p>
       <w:r>
         <w:t>Sincerely,</w:t>
       </w:r>
     </w:p>
-    <w:p/>
     <w:p>
       <w:r>
         <w:t>Onishi Tatsuki, PhD</w:t>
@@ -554,7 +650,7 @@
     <w:rsid w:val="00FC693F"/>
     <w:rPr>
       <w:rFonts w:ascii="Times New Roman" w:hAnsi="Times New Roman"/>
-      <w:sz w:val="24"/>
+      <w:sz w:val="22"/>
     </w:rPr>
   </w:style>
   <w:style w:type="paragraph" w:styleId="Header">

</xml_diff>